<commit_message>
MCQ report: add 4 concrete per-question examples (3 textbook + 1 counter)
- Q22 12x12=144: cleanest signal — 4 vectors all point right way
- Q20 DNA: confident +0.227 on correct, monotone confused ramp on wrongs
- Q34 Tallest animal: stubborn +0.09-0.13 above correct on all wrongs
- Q5 Largest population: counter-example, signal blunts when model is itself
  uncertain (India recently overtook China; question omits China)

The pattern reveals a 'correct-answer fingerprint': confused/stubborn DOWN,
confident/bored UP. Stubborn is the strongest single discriminator (d=-1.34
means it's almost always positive on wrongs). Counter-example shows the
signal degrades on inherently-uncertain questions — natural lead-in to the
'novel-but-correct' next experiment.
</commit_message>
<xml_diff>
--- a/docs/mcq_result_en.docx
+++ b/docs/mcq_result_en.docx
@@ -10,7 +10,7 @@
         <w:t xml:space="preserve">MCQ Experiment Results</w:t>
       </w:r>
     </w:p>
-    <w:bookmarkStart w:id="32" w:name="mcq-experiment-results-memo-english"/>
+    <w:bookmarkStart w:id="38" w:name="mcq-experiment-results-memo-english"/>
     <w:p>
       <w:pPr>
         <w:pStyle w:val="Heading1"/>
@@ -831,7 +831,7 @@
     </w:p>
     <w:bookmarkEnd w:id="13"/>
     <w:bookmarkEnd w:id="14"/>
-    <w:bookmarkStart w:id="23" w:name="results"/>
+    <w:bookmarkStart w:id="29" w:name="results"/>
     <w:p>
       <w:pPr>
         <w:pStyle w:val="Heading2"/>
@@ -1731,6 +1731,1881 @@
         <w:t xml:space="preserve">— that’s our judgment signal.</w:t>
       </w:r>
     </w:p>
+    <w:bookmarkEnd w:id="22"/>
+    <w:bookmarkStart w:id="27" w:name="Xe19fa19ce88a9339054cb72db3d35b8071a18c3"/>
+    <w:p>
+      <w:pPr>
+        <w:pStyle w:val="Heading3"/>
+      </w:pPr>
+      <w:r>
+        <w:t xml:space="preserve">2.3 Three concrete questions in detail (textbook examples + counter-example)</w:t>
+      </w:r>
+    </w:p>
+    <w:p>
+      <w:pPr>
+        <w:pStyle w:val="FirstParagraph"/>
+      </w:pPr>
+      <w:r>
+        <w:t xml:space="preserve">The aggregate numbers look great, but we should verify the signal holds at the per-question level. Here are three case studies showing different patterns.</w:t>
+      </w:r>
+    </w:p>
+    <w:bookmarkStart w:id="23" w:name="X47cbd4adcbd996f1c7a070bbce42e7c625936cf"/>
+    <w:p>
+      <w:pPr>
+        <w:pStyle w:val="Heading4"/>
+      </w:pPr>
+      <w:r>
+        <w:t xml:space="preserve">📐 Example 1: Q22 Math —</w:t>
+      </w:r>
+      <w:r>
+        <w:t xml:space="preserve"> </w:t>
+      </w:r>
+      <w:r>
+        <w:t xml:space="preserve">“12 × 12 = ?”</w:t>
+      </w:r>
+      <w:r>
+        <w:t xml:space="preserve"> </w:t>
+      </w:r>
+      <w:r>
+        <w:t xml:space="preserve">(textbook clean signal)</w:t>
+      </w:r>
+    </w:p>
+    <w:p>
+      <w:pPr>
+        <w:pStyle w:val="FirstParagraph"/>
+      </w:pPr>
+      <w:r>
+        <w:t xml:space="preserve">Each row is one candidate answer; each column is one vector’s projection at the answer-token position.</w:t>
+      </w:r>
+    </w:p>
+    <w:tbl>
+      <w:tblPr>
+        <w:tblStyle w:val="Table"/>
+        <w:tblW w:type="pct" w:w="5000"/>
+        <w:tblLayout w:type="fixed"/>
+        <w:tblLook w:firstRow="1" w:lastRow="0" w:firstColumn="0" w:lastColumn="0" w:noHBand="0" w:noVBand="0" w:val="0020"/>
+      </w:tblPr>
+      <w:tblGrid>
+        <w:gridCol w:w="1584"/>
+        <w:gridCol w:w="1584"/>
+        <w:gridCol w:w="1584"/>
+        <w:gridCol w:w="1584"/>
+        <w:gridCol w:w="1584"/>
+      </w:tblGrid>
+      <w:tr>
+        <w:trPr>
+          <w:tblHeader w:val="on"/>
+        </w:trPr>
+        <w:tc>
+          <w:tcPr/>
+          <w:p>
+            <w:pPr>
+              <w:pStyle w:val="Compact"/>
+            </w:pPr>
+            <w:r>
+              <w:t xml:space="preserve">Option</w:t>
+            </w:r>
+          </w:p>
+        </w:tc>
+        <w:tc>
+          <w:tcPr/>
+          <w:p>
+            <w:pPr>
+              <w:pStyle w:val="Compact"/>
+            </w:pPr>
+            <w:r>
+              <w:t xml:space="preserve">confused</w:t>
+            </w:r>
+          </w:p>
+        </w:tc>
+        <w:tc>
+          <w:tcPr/>
+          <w:p>
+            <w:pPr>
+              <w:pStyle w:val="Compact"/>
+            </w:pPr>
+            <w:r>
+              <w:t xml:space="preserve">stubborn</w:t>
+            </w:r>
+          </w:p>
+        </w:tc>
+        <w:tc>
+          <w:tcPr/>
+          <w:p>
+            <w:pPr>
+              <w:pStyle w:val="Compact"/>
+            </w:pPr>
+            <w:r>
+              <w:t xml:space="preserve">bored</w:t>
+            </w:r>
+          </w:p>
+        </w:tc>
+        <w:tc>
+          <w:tcPr/>
+          <w:p>
+            <w:pPr>
+              <w:pStyle w:val="Compact"/>
+            </w:pPr>
+            <w:r>
+              <w:t xml:space="preserve">confident</w:t>
+            </w:r>
+          </w:p>
+        </w:tc>
+      </w:tr>
+      <w:tr>
+        <w:tc>
+          <w:tcPr/>
+          <w:p>
+            <w:pPr>
+              <w:pStyle w:val="Compact"/>
+            </w:pPr>
+            <w:r>
+              <w:t xml:space="preserve">✗ A) 124</w:t>
+            </w:r>
+          </w:p>
+        </w:tc>
+        <w:tc>
+          <w:tcPr/>
+          <w:p>
+            <w:pPr>
+              <w:pStyle w:val="Compact"/>
+            </w:pPr>
+            <w:r>
+              <w:t xml:space="preserve">−0.089</w:t>
+            </w:r>
+          </w:p>
+        </w:tc>
+        <w:tc>
+          <w:tcPr/>
+          <w:p>
+            <w:pPr>
+              <w:pStyle w:val="Compact"/>
+            </w:pPr>
+            <w:r>
+              <w:rPr>
+                <w:b/>
+                <w:bCs/>
+              </w:rPr>
+              <w:t xml:space="preserve">+0.062</w:t>
+            </w:r>
+            <w:r>
+              <w:t xml:space="preserve"> </w:t>
+            </w:r>
+            <w:r>
+              <w:t xml:space="preserve">❗</w:t>
+            </w:r>
+          </w:p>
+        </w:tc>
+        <w:tc>
+          <w:tcPr/>
+          <w:p>
+            <w:pPr>
+              <w:pStyle w:val="Compact"/>
+            </w:pPr>
+            <w:r>
+              <w:t xml:space="preserve">−0.091</w:t>
+            </w:r>
+          </w:p>
+        </w:tc>
+        <w:tc>
+          <w:tcPr/>
+          <w:p>
+            <w:pPr>
+              <w:pStyle w:val="Compact"/>
+            </w:pPr>
+            <w:r>
+              <w:t xml:space="preserve">+0.150</w:t>
+            </w:r>
+          </w:p>
+        </w:tc>
+      </w:tr>
+      <w:tr>
+        <w:tc>
+          <w:tcPr/>
+          <w:p>
+            <w:pPr>
+              <w:pStyle w:val="Compact"/>
+            </w:pPr>
+            <w:r>
+              <w:rPr>
+                <w:b/>
+                <w:bCs/>
+              </w:rPr>
+              <w:t xml:space="preserve">✓ B) 144</w:t>
+            </w:r>
+          </w:p>
+        </w:tc>
+        <w:tc>
+          <w:tcPr/>
+          <w:p>
+            <w:pPr>
+              <w:pStyle w:val="Compact"/>
+            </w:pPr>
+            <w:r>
+              <w:rPr>
+                <w:b/>
+                <w:bCs/>
+              </w:rPr>
+              <w:t xml:space="preserve">−0.140</w:t>
+            </w:r>
+            <w:r>
+              <w:t xml:space="preserve"> </w:t>
+            </w:r>
+            <w:r>
+              <w:t xml:space="preserve">✓</w:t>
+            </w:r>
+          </w:p>
+        </w:tc>
+        <w:tc>
+          <w:tcPr/>
+          <w:p>
+            <w:pPr>
+              <w:pStyle w:val="Compact"/>
+            </w:pPr>
+            <w:r>
+              <w:rPr>
+                <w:b/>
+                <w:bCs/>
+              </w:rPr>
+              <w:t xml:space="preserve">−0.080</w:t>
+            </w:r>
+            <w:r>
+              <w:t xml:space="preserve"> </w:t>
+            </w:r>
+            <w:r>
+              <w:t xml:space="preserve">✓</w:t>
+            </w:r>
+          </w:p>
+        </w:tc>
+        <w:tc>
+          <w:tcPr/>
+          <w:p>
+            <w:pPr>
+              <w:pStyle w:val="Compact"/>
+            </w:pPr>
+            <w:r>
+              <w:rPr>
+                <w:b/>
+                <w:bCs/>
+              </w:rPr>
+              <w:t xml:space="preserve">−0.035</w:t>
+            </w:r>
+            <w:r>
+              <w:t xml:space="preserve"> </w:t>
+            </w:r>
+            <w:r>
+              <w:t xml:space="preserve">✓</w:t>
+            </w:r>
+          </w:p>
+        </w:tc>
+        <w:tc>
+          <w:tcPr/>
+          <w:p>
+            <w:pPr>
+              <w:pStyle w:val="Compact"/>
+            </w:pPr>
+            <w:r>
+              <w:rPr>
+                <w:b/>
+                <w:bCs/>
+              </w:rPr>
+              <w:t xml:space="preserve">+0.235</w:t>
+            </w:r>
+            <w:r>
+              <w:t xml:space="preserve"> </w:t>
+            </w:r>
+            <w:r>
+              <w:t xml:space="preserve">✓</w:t>
+            </w:r>
+          </w:p>
+        </w:tc>
+      </w:tr>
+      <w:tr>
+        <w:tc>
+          <w:tcPr/>
+          <w:p>
+            <w:pPr>
+              <w:pStyle w:val="Compact"/>
+            </w:pPr>
+            <w:r>
+              <w:t xml:space="preserve">✗ C) 164</w:t>
+            </w:r>
+          </w:p>
+        </w:tc>
+        <w:tc>
+          <w:tcPr/>
+          <w:p>
+            <w:pPr>
+              <w:pStyle w:val="Compact"/>
+            </w:pPr>
+            <w:r>
+              <w:t xml:space="preserve">−0.075</w:t>
+            </w:r>
+          </w:p>
+        </w:tc>
+        <w:tc>
+          <w:tcPr/>
+          <w:p>
+            <w:pPr>
+              <w:pStyle w:val="Compact"/>
+            </w:pPr>
+            <w:r>
+              <w:t xml:space="preserve">+0.026</w:t>
+            </w:r>
+          </w:p>
+        </w:tc>
+        <w:tc>
+          <w:tcPr/>
+          <w:p>
+            <w:pPr>
+              <w:pStyle w:val="Compact"/>
+            </w:pPr>
+            <w:r>
+              <w:t xml:space="preserve">−0.101</w:t>
+            </w:r>
+          </w:p>
+        </w:tc>
+        <w:tc>
+          <w:tcPr/>
+          <w:p>
+            <w:pPr>
+              <w:pStyle w:val="Compact"/>
+            </w:pPr>
+            <w:r>
+              <w:t xml:space="preserve">+0.179</w:t>
+            </w:r>
+          </w:p>
+        </w:tc>
+      </w:tr>
+      <w:tr>
+        <w:tc>
+          <w:tcPr/>
+          <w:p>
+            <w:pPr>
+              <w:pStyle w:val="Compact"/>
+            </w:pPr>
+            <w:r>
+              <w:t xml:space="preserve">✗ D) 184</w:t>
+            </w:r>
+          </w:p>
+        </w:tc>
+        <w:tc>
+          <w:tcPr/>
+          <w:p>
+            <w:pPr>
+              <w:pStyle w:val="Compact"/>
+            </w:pPr>
+            <w:r>
+              <w:t xml:space="preserve">−0.083</w:t>
+            </w:r>
+          </w:p>
+        </w:tc>
+        <w:tc>
+          <w:tcPr/>
+          <w:p>
+            <w:pPr>
+              <w:pStyle w:val="Compact"/>
+            </w:pPr>
+            <w:r>
+              <w:t xml:space="preserve">−0.001</w:t>
+            </w:r>
+          </w:p>
+        </w:tc>
+        <w:tc>
+          <w:tcPr/>
+          <w:p>
+            <w:pPr>
+              <w:pStyle w:val="Compact"/>
+            </w:pPr>
+            <w:r>
+              <w:t xml:space="preserve">−0.088</w:t>
+            </w:r>
+          </w:p>
+        </w:tc>
+        <w:tc>
+          <w:tcPr/>
+          <w:p>
+            <w:pPr>
+              <w:pStyle w:val="Compact"/>
+            </w:pPr>
+            <w:r>
+              <w:t xml:space="preserve">+0.210</w:t>
+            </w:r>
+          </w:p>
+        </w:tc>
+      </w:tr>
+    </w:tbl>
+    <w:p>
+      <w:pPr>
+        <w:pStyle w:val="BodyText"/>
+      </w:pPr>
+      <w:r>
+        <w:rPr>
+          <w:b/>
+          <w:bCs/>
+        </w:rPr>
+        <w:t xml:space="preserve">How to read this</w:t>
+      </w:r>
+      <w:r>
+        <w:t xml:space="preserve">: all 4 vectors point in the</w:t>
+      </w:r>
+      <w:r>
+        <w:t xml:space="preserve"> </w:t>
+      </w:r>
+      <w:r>
+        <w:rPr>
+          <w:b/>
+          <w:bCs/>
+        </w:rPr>
+        <w:t xml:space="preserve">same direction</w:t>
+      </w:r>
+      <w:r>
+        <w:t xml:space="preserve"> </w:t>
+      </w:r>
+      <w:r>
+        <w:t xml:space="preserve">—</w:t>
+      </w:r>
+      <w:r>
+        <w:t xml:space="preserve"> </w:t>
+      </w:r>
+      <w:r>
+        <w:t xml:space="preserve">-</w:t>
+      </w:r>
+      <w:r>
+        <w:t xml:space="preserve"> </w:t>
+      </w:r>
+      <w:r>
+        <w:rPr>
+          <w:b/>
+          <w:bCs/>
+        </w:rPr>
+        <w:t xml:space="preserve">confused</w:t>
+      </w:r>
+      <w:r>
+        <w:t xml:space="preserve">: correct answer is −0.140 (lowest, model least confused); all 3 wrongs higher</w:t>
+      </w:r>
+      <w:r>
+        <w:t xml:space="preserve"> </w:t>
+      </w:r>
+      <w:r>
+        <w:t xml:space="preserve">-</w:t>
+      </w:r>
+      <w:r>
+        <w:t xml:space="preserve"> </w:t>
+      </w:r>
+      <w:r>
+        <w:rPr>
+          <w:b/>
+          <w:bCs/>
+        </w:rPr>
+        <w:t xml:space="preserve">stubborn</w:t>
+      </w:r>
+      <w:r>
+        <w:t xml:space="preserve">: correct answer is −0.080 (lowest, model least resistant); A) 124 jumps to +0.062</w:t>
+      </w:r>
+      <w:r>
+        <w:t xml:space="preserve"> </w:t>
+      </w:r>
+      <w:r>
+        <w:t xml:space="preserve">-</w:t>
+      </w:r>
+      <w:r>
+        <w:t xml:space="preserve"> </w:t>
+      </w:r>
+      <w:r>
+        <w:rPr>
+          <w:b/>
+          <w:bCs/>
+        </w:rPr>
+        <w:t xml:space="preserve">bored</w:t>
+      </w:r>
+      <w:r>
+        <w:t xml:space="preserve">: correct answer is −0.035 (highest,</w:t>
+      </w:r>
+      <w:r>
+        <w:t xml:space="preserve"> </w:t>
+      </w:r>
+      <w:r>
+        <w:t xml:space="preserve">“nothing new here”</w:t>
+      </w:r>
+      <w:r>
+        <w:t xml:space="preserve">)</w:t>
+      </w:r>
+      <w:r>
+        <w:t xml:space="preserve"> </w:t>
+      </w:r>
+      <w:r>
+        <w:t xml:space="preserve">-</w:t>
+      </w:r>
+      <w:r>
+        <w:t xml:space="preserve"> </w:t>
+      </w:r>
+      <w:r>
+        <w:rPr>
+          <w:b/>
+          <w:bCs/>
+        </w:rPr>
+        <w:t xml:space="preserve">confident</w:t>
+      </w:r>
+      <w:r>
+        <w:t xml:space="preserve">: correct answer is +0.235 (highest, confident)</w:t>
+      </w:r>
+    </w:p>
+    <w:p>
+      <w:pPr>
+        <w:pStyle w:val="BodyText"/>
+      </w:pPr>
+      <w:r>
+        <w:rPr>
+          <w:b/>
+          <w:bCs/>
+        </w:rPr>
+        <w:t xml:space="preserve">Plain-English</w:t>
+      </w:r>
+      <w:r>
+        <w:t xml:space="preserve">: when the model reads</w:t>
+      </w:r>
+      <w:r>
+        <w:t xml:space="preserve"> </w:t>
+      </w:r>
+      <w:r>
+        <w:t xml:space="preserve">“144”</w:t>
+      </w:r>
+      <w:r>
+        <w:t xml:space="preserve">, the residual stream shows</w:t>
+      </w:r>
+      <w:r>
+        <w:t xml:space="preserve"> </w:t>
+      </w:r>
+      <w:r>
+        <w:rPr>
+          <w:b/>
+          <w:bCs/>
+        </w:rPr>
+        <w:t xml:space="preserve">5 signals simultaneously expressing</w:t>
+      </w:r>
+      <w:r>
+        <w:rPr>
+          <w:b/>
+          <w:bCs/>
+        </w:rPr>
+        <w:t xml:space="preserve"> </w:t>
+      </w:r>
+      <w:r>
+        <w:rPr>
+          <w:b/>
+          <w:bCs/>
+        </w:rPr>
+        <w:t xml:space="preserve">“I recognize this answer”</w:t>
+      </w:r>
+      <w:r>
+        <w:t xml:space="preserve">: not confused, not resistant, slightly bored (it’s well-known), confident. When reading</w:t>
+      </w:r>
+      <w:r>
+        <w:t xml:space="preserve"> </w:t>
+      </w:r>
+      <w:r>
+        <w:t xml:space="preserve">“124”</w:t>
+      </w:r>
+      <w:r>
+        <w:t xml:space="preserve">,</w:t>
+      </w:r>
+      <w:r>
+        <w:t xml:space="preserve"> </w:t>
+      </w:r>
+      <w:r>
+        <w:rPr>
+          <w:rStyle w:val="VerbatimChar"/>
+        </w:rPr>
+        <w:t xml:space="preserve">stubborn</w:t>
+      </w:r>
+      <w:r>
+        <w:t xml:space="preserve"> </w:t>
+      </w:r>
+      <w:r>
+        <w:t xml:space="preserve">immediately spikes — the model is</w:t>
+      </w:r>
+      <w:r>
+        <w:t xml:space="preserve"> </w:t>
+      </w:r>
+      <w:r>
+        <w:rPr>
+          <w:b/>
+          <w:bCs/>
+        </w:rPr>
+        <w:t xml:space="preserve">internally rejecting</w:t>
+      </w:r>
+      <w:r>
+        <w:t xml:space="preserve"> </w:t>
+      </w:r>
+      <w:r>
+        <w:t xml:space="preserve">this wrong answer.</w:t>
+      </w:r>
+    </w:p>
+    <w:bookmarkEnd w:id="23"/>
+    <w:bookmarkStart w:id="24" w:name="Xf3e21a984ca5f328e81a7b6bc4a441e828d397e"/>
+    <w:p>
+      <w:pPr>
+        <w:pStyle w:val="Heading4"/>
+      </w:pPr>
+      <w:r>
+        <w:t xml:space="preserve">🧬 Example 2: Q20 Science —</w:t>
+      </w:r>
+      <w:r>
+        <w:t xml:space="preserve"> </w:t>
+      </w:r>
+      <w:r>
+        <w:t xml:space="preserve">“DNA stands for?”</w:t>
+      </w:r>
+      <w:r>
+        <w:t xml:space="preserve"> </w:t>
+      </w:r>
+      <w:r>
+        <w:t xml:space="preserve">(clean confident marker)</w:t>
+      </w:r>
+    </w:p>
+    <w:tbl>
+      <w:tblPr>
+        <w:tblStyle w:val="Table"/>
+        <w:tblW w:type="pct" w:w="5000"/>
+        <w:tblLayout w:type="fixed"/>
+        <w:tblLook w:firstRow="1" w:lastRow="0" w:firstColumn="0" w:lastColumn="0" w:noHBand="0" w:noVBand="0" w:val="0020"/>
+      </w:tblPr>
+      <w:tblGrid>
+        <w:gridCol w:w="1584"/>
+        <w:gridCol w:w="1584"/>
+        <w:gridCol w:w="1584"/>
+        <w:gridCol w:w="1584"/>
+        <w:gridCol w:w="1584"/>
+      </w:tblGrid>
+      <w:tr>
+        <w:trPr>
+          <w:tblHeader w:val="on"/>
+        </w:trPr>
+        <w:tc>
+          <w:tcPr/>
+          <w:p>
+            <w:pPr>
+              <w:pStyle w:val="Compact"/>
+            </w:pPr>
+            <w:r>
+              <w:t xml:space="preserve">Option</w:t>
+            </w:r>
+          </w:p>
+        </w:tc>
+        <w:tc>
+          <w:tcPr/>
+          <w:p>
+            <w:pPr>
+              <w:pStyle w:val="Compact"/>
+            </w:pPr>
+            <w:r>
+              <w:t xml:space="preserve">confused</w:t>
+            </w:r>
+          </w:p>
+        </w:tc>
+        <w:tc>
+          <w:tcPr/>
+          <w:p>
+            <w:pPr>
+              <w:pStyle w:val="Compact"/>
+            </w:pPr>
+            <w:r>
+              <w:t xml:space="preserve">stubborn</w:t>
+            </w:r>
+          </w:p>
+        </w:tc>
+        <w:tc>
+          <w:tcPr/>
+          <w:p>
+            <w:pPr>
+              <w:pStyle w:val="Compact"/>
+            </w:pPr>
+            <w:r>
+              <w:t xml:space="preserve">bored</w:t>
+            </w:r>
+          </w:p>
+        </w:tc>
+        <w:tc>
+          <w:tcPr/>
+          <w:p>
+            <w:pPr>
+              <w:pStyle w:val="Compact"/>
+            </w:pPr>
+            <w:r>
+              <w:t xml:space="preserve">confident</w:t>
+            </w:r>
+          </w:p>
+        </w:tc>
+      </w:tr>
+      <w:tr>
+        <w:tc>
+          <w:tcPr/>
+          <w:p>
+            <w:pPr>
+              <w:pStyle w:val="Compact"/>
+            </w:pPr>
+            <w:r>
+              <w:rPr>
+                <w:b/>
+                <w:bCs/>
+              </w:rPr>
+              <w:t xml:space="preserve">✓ A) Deoxyribonucleic acid</w:t>
+            </w:r>
+          </w:p>
+        </w:tc>
+        <w:tc>
+          <w:tcPr/>
+          <w:p>
+            <w:pPr>
+              <w:pStyle w:val="Compact"/>
+            </w:pPr>
+            <w:r>
+              <w:rPr>
+                <w:b/>
+                <w:bCs/>
+              </w:rPr>
+              <w:t xml:space="preserve">−0.138</w:t>
+            </w:r>
+            <w:r>
+              <w:t xml:space="preserve"> </w:t>
+            </w:r>
+            <w:r>
+              <w:t xml:space="preserve">✓</w:t>
+            </w:r>
+          </w:p>
+        </w:tc>
+        <w:tc>
+          <w:tcPr/>
+          <w:p>
+            <w:pPr>
+              <w:pStyle w:val="Compact"/>
+            </w:pPr>
+            <w:r>
+              <w:rPr>
+                <w:b/>
+                <w:bCs/>
+              </w:rPr>
+              <w:t xml:space="preserve">−0.053</w:t>
+            </w:r>
+            <w:r>
+              <w:t xml:space="preserve"> </w:t>
+            </w:r>
+            <w:r>
+              <w:t xml:space="preserve">✓</w:t>
+            </w:r>
+          </w:p>
+        </w:tc>
+        <w:tc>
+          <w:tcPr/>
+          <w:p>
+            <w:pPr>
+              <w:pStyle w:val="Compact"/>
+            </w:pPr>
+            <w:r>
+              <w:t xml:space="preserve">−0.062</w:t>
+            </w:r>
+          </w:p>
+        </w:tc>
+        <w:tc>
+          <w:tcPr/>
+          <w:p>
+            <w:pPr>
+              <w:pStyle w:val="Compact"/>
+            </w:pPr>
+            <w:r>
+              <w:rPr>
+                <w:b/>
+                <w:bCs/>
+              </w:rPr>
+              <w:t xml:space="preserve">+0.227</w:t>
+            </w:r>
+            <w:r>
+              <w:t xml:space="preserve"> </w:t>
+            </w:r>
+            <w:r>
+              <w:t xml:space="preserve">✓</w:t>
+            </w:r>
+          </w:p>
+        </w:tc>
+      </w:tr>
+      <w:tr>
+        <w:tc>
+          <w:tcPr/>
+          <w:p>
+            <w:pPr>
+              <w:pStyle w:val="Compact"/>
+            </w:pPr>
+            <w:r>
+              <w:t xml:space="preserve">✗ B) Dinitrogen acid</w:t>
+            </w:r>
+          </w:p>
+        </w:tc>
+        <w:tc>
+          <w:tcPr/>
+          <w:p>
+            <w:pPr>
+              <w:pStyle w:val="Compact"/>
+            </w:pPr>
+            <w:r>
+              <w:t xml:space="preserve">−0.072</w:t>
+            </w:r>
+          </w:p>
+        </w:tc>
+        <w:tc>
+          <w:tcPr/>
+          <w:p>
+            <w:pPr>
+              <w:pStyle w:val="Compact"/>
+            </w:pPr>
+            <w:r>
+              <w:rPr>
+                <w:b/>
+                <w:bCs/>
+              </w:rPr>
+              <w:t xml:space="preserve">+0.047</w:t>
+            </w:r>
+          </w:p>
+        </w:tc>
+        <w:tc>
+          <w:tcPr/>
+          <w:p>
+            <w:pPr>
+              <w:pStyle w:val="Compact"/>
+            </w:pPr>
+            <w:r>
+              <w:t xml:space="preserve">−0.086</w:t>
+            </w:r>
+          </w:p>
+        </w:tc>
+        <w:tc>
+          <w:tcPr/>
+          <w:p>
+            <w:pPr>
+              <w:pStyle w:val="Compact"/>
+            </w:pPr>
+            <w:r>
+              <w:t xml:space="preserve">+0.169</w:t>
+            </w:r>
+          </w:p>
+        </w:tc>
+      </w:tr>
+      <w:tr>
+        <w:tc>
+          <w:tcPr/>
+          <w:p>
+            <w:pPr>
+              <w:pStyle w:val="Compact"/>
+            </w:pPr>
+            <w:r>
+              <w:t xml:space="preserve">✗ C) Dynamic nuclear array</w:t>
+            </w:r>
+          </w:p>
+        </w:tc>
+        <w:tc>
+          <w:tcPr/>
+          <w:p>
+            <w:pPr>
+              <w:pStyle w:val="Compact"/>
+            </w:pPr>
+            <w:r>
+              <w:t xml:space="preserve">−0.030</w:t>
+            </w:r>
+          </w:p>
+        </w:tc>
+        <w:tc>
+          <w:tcPr/>
+          <w:p>
+            <w:pPr>
+              <w:pStyle w:val="Compact"/>
+            </w:pPr>
+            <w:r>
+              <w:t xml:space="preserve">+0.059</w:t>
+            </w:r>
+          </w:p>
+        </w:tc>
+        <w:tc>
+          <w:tcPr/>
+          <w:p>
+            <w:pPr>
+              <w:pStyle w:val="Compact"/>
+            </w:pPr>
+            <w:r>
+              <w:rPr>
+                <w:b/>
+                <w:bCs/>
+              </w:rPr>
+              <w:t xml:space="preserve">−0.135</w:t>
+            </w:r>
+          </w:p>
+        </w:tc>
+        <w:tc>
+          <w:tcPr/>
+          <w:p>
+            <w:pPr>
+              <w:pStyle w:val="Compact"/>
+            </w:pPr>
+            <w:r>
+              <w:t xml:space="preserve">+0.153</w:t>
+            </w:r>
+          </w:p>
+        </w:tc>
+      </w:tr>
+      <w:tr>
+        <w:tc>
+          <w:tcPr/>
+          <w:p>
+            <w:pPr>
+              <w:pStyle w:val="Compact"/>
+            </w:pPr>
+            <w:r>
+              <w:t xml:space="preserve">✗ D) Dual nucleic atom</w:t>
+            </w:r>
+          </w:p>
+        </w:tc>
+        <w:tc>
+          <w:tcPr/>
+          <w:p>
+            <w:pPr>
+              <w:pStyle w:val="Compact"/>
+            </w:pPr>
+            <w:r>
+              <w:t xml:space="preserve">−0.044</w:t>
+            </w:r>
+          </w:p>
+        </w:tc>
+        <w:tc>
+          <w:tcPr/>
+          <w:p>
+            <w:pPr>
+              <w:pStyle w:val="Compact"/>
+            </w:pPr>
+            <w:r>
+              <w:t xml:space="preserve">+0.045</w:t>
+            </w:r>
+          </w:p>
+        </w:tc>
+        <w:tc>
+          <w:tcPr/>
+          <w:p>
+            <w:pPr>
+              <w:pStyle w:val="Compact"/>
+            </w:pPr>
+            <w:r>
+              <w:t xml:space="preserve">−0.110</w:t>
+            </w:r>
+          </w:p>
+        </w:tc>
+        <w:tc>
+          <w:tcPr/>
+          <w:p>
+            <w:pPr>
+              <w:pStyle w:val="Compact"/>
+            </w:pPr>
+            <w:r>
+              <w:t xml:space="preserve">+0.158</w:t>
+            </w:r>
+          </w:p>
+        </w:tc>
+      </w:tr>
+    </w:tbl>
+    <w:p>
+      <w:pPr>
+        <w:pStyle w:val="BodyText"/>
+      </w:pPr>
+      <w:r>
+        <w:rPr>
+          <w:b/>
+          <w:bCs/>
+        </w:rPr>
+        <w:t xml:space="preserve">Highlight</w:t>
+      </w:r>
+      <w:r>
+        <w:t xml:space="preserve">: confident on correct answer is +0.227,</w:t>
+      </w:r>
+      <w:r>
+        <w:t xml:space="preserve"> </w:t>
+      </w:r>
+      <w:r>
+        <w:rPr>
+          <w:b/>
+          <w:bCs/>
+        </w:rPr>
+        <w:t xml:space="preserve">0.06+ higher than all 3 wrong answers</w:t>
+      </w:r>
+      <w:r>
+        <w:t xml:space="preserve">. The model is essentially saying</w:t>
+      </w:r>
+      <w:r>
+        <w:t xml:space="preserve"> </w:t>
+      </w:r>
+      <w:r>
+        <w:t xml:space="preserve">“</w:t>
+      </w:r>
+      <w:r>
+        <w:rPr>
+          <w:b/>
+          <w:bCs/>
+        </w:rPr>
+        <w:t xml:space="preserve">yes, that’s DNA</w:t>
+      </w:r>
+      <w:r>
+        <w:t xml:space="preserve">”</w:t>
+      </w:r>
+      <w:r>
+        <w:t xml:space="preserve">.</w:t>
+      </w:r>
+      <w:r>
+        <w:t xml:space="preserve"> </w:t>
+      </w:r>
+      <w:r>
+        <w:rPr>
+          <w:rStyle w:val="VerbatimChar"/>
+        </w:rPr>
+        <w:t xml:space="preserve">confused</w:t>
+      </w:r>
+      <w:r>
+        <w:t xml:space="preserve"> </w:t>
+      </w:r>
+      <w:r>
+        <w:t xml:space="preserve">ramps up monotonically toward more absurd wrong answers, peaking at C)</w:t>
+      </w:r>
+      <w:r>
+        <w:t xml:space="preserve"> </w:t>
+      </w:r>
+      <w:r>
+        <w:t xml:space="preserve">“Dynamic nuclear array”</w:t>
+      </w:r>
+      <w:r>
+        <w:t xml:space="preserve"> </w:t>
+      </w:r>
+      <w:r>
+        <w:t xml:space="preserve">(−0.030, near zero) — exactly what cognitive dissonance looks like.</w:t>
+      </w:r>
+    </w:p>
+    <w:bookmarkEnd w:id="24"/>
+    <w:bookmarkStart w:id="25" w:name="X96d5c2f571b3170fe489d2c46c4e7deb493d5b6"/>
+    <w:p>
+      <w:pPr>
+        <w:pStyle w:val="Heading4"/>
+      </w:pPr>
+      <w:r>
+        <w:t xml:space="preserve">🦒 Example 3: Q34 General —</w:t>
+      </w:r>
+      <w:r>
+        <w:t xml:space="preserve"> </w:t>
+      </w:r>
+      <w:r>
+        <w:t xml:space="preserve">“What is the tallest animal?”</w:t>
+      </w:r>
+      <w:r>
+        <w:t xml:space="preserve"> </w:t>
+      </w:r>
+      <w:r>
+        <w:t xml:space="preserve">(all 4 vectors hit)</w:t>
+      </w:r>
+    </w:p>
+    <w:tbl>
+      <w:tblPr>
+        <w:tblStyle w:val="Table"/>
+        <w:tblW w:type="pct" w:w="5000"/>
+        <w:tblLayout w:type="fixed"/>
+        <w:tblLook w:firstRow="1" w:lastRow="0" w:firstColumn="0" w:lastColumn="0" w:noHBand="0" w:noVBand="0" w:val="0020"/>
+      </w:tblPr>
+      <w:tblGrid>
+        <w:gridCol w:w="1584"/>
+        <w:gridCol w:w="1584"/>
+        <w:gridCol w:w="1584"/>
+        <w:gridCol w:w="1584"/>
+        <w:gridCol w:w="1584"/>
+      </w:tblGrid>
+      <w:tr>
+        <w:trPr>
+          <w:tblHeader w:val="on"/>
+        </w:trPr>
+        <w:tc>
+          <w:tcPr/>
+          <w:p>
+            <w:pPr>
+              <w:pStyle w:val="Compact"/>
+            </w:pPr>
+            <w:r>
+              <w:t xml:space="preserve">Option</w:t>
+            </w:r>
+          </w:p>
+        </w:tc>
+        <w:tc>
+          <w:tcPr/>
+          <w:p>
+            <w:pPr>
+              <w:pStyle w:val="Compact"/>
+            </w:pPr>
+            <w:r>
+              <w:t xml:space="preserve">confused</w:t>
+            </w:r>
+          </w:p>
+        </w:tc>
+        <w:tc>
+          <w:tcPr/>
+          <w:p>
+            <w:pPr>
+              <w:pStyle w:val="Compact"/>
+            </w:pPr>
+            <w:r>
+              <w:t xml:space="preserve">stubborn</w:t>
+            </w:r>
+          </w:p>
+        </w:tc>
+        <w:tc>
+          <w:tcPr/>
+          <w:p>
+            <w:pPr>
+              <w:pStyle w:val="Compact"/>
+            </w:pPr>
+            <w:r>
+              <w:t xml:space="preserve">bored</w:t>
+            </w:r>
+          </w:p>
+        </w:tc>
+        <w:tc>
+          <w:tcPr/>
+          <w:p>
+            <w:pPr>
+              <w:pStyle w:val="Compact"/>
+            </w:pPr>
+            <w:r>
+              <w:t xml:space="preserve">confident</w:t>
+            </w:r>
+          </w:p>
+        </w:tc>
+      </w:tr>
+      <w:tr>
+        <w:tc>
+          <w:tcPr/>
+          <w:p>
+            <w:pPr>
+              <w:pStyle w:val="Compact"/>
+            </w:pPr>
+            <w:r>
+              <w:t xml:space="preserve">✗ A) Elephant</w:t>
+            </w:r>
+          </w:p>
+        </w:tc>
+        <w:tc>
+          <w:tcPr/>
+          <w:p>
+            <w:pPr>
+              <w:pStyle w:val="Compact"/>
+            </w:pPr>
+            <w:r>
+              <w:t xml:space="preserve">−0.075</w:t>
+            </w:r>
+          </w:p>
+        </w:tc>
+        <w:tc>
+          <w:tcPr/>
+          <w:p>
+            <w:pPr>
+              <w:pStyle w:val="Compact"/>
+            </w:pPr>
+            <w:r>
+              <w:rPr>
+                <w:b/>
+                <w:bCs/>
+              </w:rPr>
+              <w:t xml:space="preserve">+0.086</w:t>
+            </w:r>
+          </w:p>
+        </w:tc>
+        <w:tc>
+          <w:tcPr/>
+          <w:p>
+            <w:pPr>
+              <w:pStyle w:val="Compact"/>
+            </w:pPr>
+            <w:r>
+              <w:t xml:space="preserve">−0.107</w:t>
+            </w:r>
+          </w:p>
+        </w:tc>
+        <w:tc>
+          <w:tcPr/>
+          <w:p>
+            <w:pPr>
+              <w:pStyle w:val="Compact"/>
+            </w:pPr>
+            <w:r>
+              <w:t xml:space="preserve">+0.093</w:t>
+            </w:r>
+          </w:p>
+        </w:tc>
+      </w:tr>
+      <w:tr>
+        <w:tc>
+          <w:tcPr/>
+          <w:p>
+            <w:pPr>
+              <w:pStyle w:val="Compact"/>
+            </w:pPr>
+            <w:r>
+              <w:rPr>
+                <w:b/>
+                <w:bCs/>
+              </w:rPr>
+              <w:t xml:space="preserve">✓ B) Giraffe</w:t>
+            </w:r>
+          </w:p>
+        </w:tc>
+        <w:tc>
+          <w:tcPr/>
+          <w:p>
+            <w:pPr>
+              <w:pStyle w:val="Compact"/>
+            </w:pPr>
+            <w:r>
+              <w:rPr>
+                <w:b/>
+                <w:bCs/>
+              </w:rPr>
+              <w:t xml:space="preserve">−0.115</w:t>
+            </w:r>
+            <w:r>
+              <w:t xml:space="preserve"> </w:t>
+            </w:r>
+            <w:r>
+              <w:t xml:space="preserve">✓</w:t>
+            </w:r>
+          </w:p>
+        </w:tc>
+        <w:tc>
+          <w:tcPr/>
+          <w:p>
+            <w:pPr>
+              <w:pStyle w:val="Compact"/>
+            </w:pPr>
+            <w:r>
+              <w:rPr>
+                <w:b/>
+                <w:bCs/>
+              </w:rPr>
+              <w:t xml:space="preserve">−0.008</w:t>
+            </w:r>
+            <w:r>
+              <w:t xml:space="preserve"> </w:t>
+            </w:r>
+            <w:r>
+              <w:t xml:space="preserve">✓</w:t>
+            </w:r>
+          </w:p>
+        </w:tc>
+        <w:tc>
+          <w:tcPr/>
+          <w:p>
+            <w:pPr>
+              <w:pStyle w:val="Compact"/>
+            </w:pPr>
+            <w:r>
+              <w:rPr>
+                <w:b/>
+                <w:bCs/>
+              </w:rPr>
+              <w:t xml:space="preserve">−0.055</w:t>
+            </w:r>
+            <w:r>
+              <w:t xml:space="preserve"> </w:t>
+            </w:r>
+            <w:r>
+              <w:t xml:space="preserve">✓</w:t>
+            </w:r>
+          </w:p>
+        </w:tc>
+        <w:tc>
+          <w:tcPr/>
+          <w:p>
+            <w:pPr>
+              <w:pStyle w:val="Compact"/>
+            </w:pPr>
+            <w:r>
+              <w:rPr>
+                <w:b/>
+                <w:bCs/>
+              </w:rPr>
+              <w:t xml:space="preserve">+0.187</w:t>
+            </w:r>
+            <w:r>
+              <w:t xml:space="preserve"> </w:t>
+            </w:r>
+            <w:r>
+              <w:t xml:space="preserve">✓</w:t>
+            </w:r>
+          </w:p>
+        </w:tc>
+      </w:tr>
+      <w:tr>
+        <w:tc>
+          <w:tcPr/>
+          <w:p>
+            <w:pPr>
+              <w:pStyle w:val="Compact"/>
+            </w:pPr>
+            <w:r>
+              <w:t xml:space="preserve">✗ C) Camel</w:t>
+            </w:r>
+          </w:p>
+        </w:tc>
+        <w:tc>
+          <w:tcPr/>
+          <w:p>
+            <w:pPr>
+              <w:pStyle w:val="Compact"/>
+            </w:pPr>
+            <w:r>
+              <w:t xml:space="preserve">−0.037</w:t>
+            </w:r>
+          </w:p>
+        </w:tc>
+        <w:tc>
+          <w:tcPr/>
+          <w:p>
+            <w:pPr>
+              <w:pStyle w:val="Compact"/>
+            </w:pPr>
+            <w:r>
+              <w:rPr>
+                <w:b/>
+                <w:bCs/>
+              </w:rPr>
+              <w:t xml:space="preserve">+0.121</w:t>
+            </w:r>
+          </w:p>
+        </w:tc>
+        <w:tc>
+          <w:tcPr/>
+          <w:p>
+            <w:pPr>
+              <w:pStyle w:val="Compact"/>
+            </w:pPr>
+            <w:r>
+              <w:t xml:space="preserve">−0.121</w:t>
+            </w:r>
+          </w:p>
+        </w:tc>
+        <w:tc>
+          <w:tcPr/>
+          <w:p>
+            <w:pPr>
+              <w:pStyle w:val="Compact"/>
+            </w:pPr>
+            <w:r>
+              <w:t xml:space="preserve">+0.056</w:t>
+            </w:r>
+          </w:p>
+        </w:tc>
+      </w:tr>
+      <w:tr>
+        <w:tc>
+          <w:tcPr/>
+          <w:p>
+            <w:pPr>
+              <w:pStyle w:val="Compact"/>
+            </w:pPr>
+            <w:r>
+              <w:t xml:space="preserve">✗ D) Horse</w:t>
+            </w:r>
+          </w:p>
+        </w:tc>
+        <w:tc>
+          <w:tcPr/>
+          <w:p>
+            <w:pPr>
+              <w:pStyle w:val="Compact"/>
+            </w:pPr>
+            <w:r>
+              <w:t xml:space="preserve">−0.021</w:t>
+            </w:r>
+          </w:p>
+        </w:tc>
+        <w:tc>
+          <w:tcPr/>
+          <w:p>
+            <w:pPr>
+              <w:pStyle w:val="Compact"/>
+            </w:pPr>
+            <w:r>
+              <w:t xml:space="preserve">+0.103</w:t>
+            </w:r>
+          </w:p>
+        </w:tc>
+        <w:tc>
+          <w:tcPr/>
+          <w:p>
+            <w:pPr>
+              <w:pStyle w:val="Compact"/>
+            </w:pPr>
+            <w:r>
+              <w:t xml:space="preserve">−0.086</w:t>
+            </w:r>
+          </w:p>
+        </w:tc>
+        <w:tc>
+          <w:tcPr/>
+          <w:p>
+            <w:pPr>
+              <w:pStyle w:val="Compact"/>
+            </w:pPr>
+            <w:r>
+              <w:t xml:space="preserve">+0.061</w:t>
+            </w:r>
+          </w:p>
+        </w:tc>
+      </w:tr>
+    </w:tbl>
+    <w:p>
+      <w:pPr>
+        <w:pStyle w:val="BodyText"/>
+      </w:pPr>
+      <w:r>
+        <w:rPr>
+          <w:b/>
+          <w:bCs/>
+        </w:rPr>
+        <w:t xml:space="preserve">Highlight</w:t>
+      </w:r>
+      <w:r>
+        <w:t xml:space="preserve">: all 3 wrong answers have stubborn +0.09 to +0.13 above correct answer. The model</w:t>
+      </w:r>
+      <w:r>
+        <w:t xml:space="preserve"> </w:t>
+      </w:r>
+      <w:r>
+        <w:rPr>
+          <w:b/>
+          <w:bCs/>
+        </w:rPr>
+        <w:t xml:space="preserve">clearly resists</w:t>
+      </w:r>
+      <w:r>
+        <w:t xml:space="preserve"> </w:t>
+      </w:r>
+      <w:r>
+        <w:t xml:space="preserve">“Camel”</w:t>
+      </w:r>
+      <w:r>
+        <w:t xml:space="preserve"> </w:t>
+      </w:r>
+      <w:r>
+        <w:t xml:space="preserve">/</w:t>
+      </w:r>
+      <w:r>
+        <w:t xml:space="preserve"> </w:t>
+      </w:r>
+      <w:r>
+        <w:t xml:space="preserve">“Horse”</w:t>
+      </w:r>
+      <w:r>
+        <w:t xml:space="preserve"> </w:t>
+      </w:r>
+      <w:r>
+        <w:t xml:space="preserve">as the tallest. A nuance: A) Elephant has confused = −0.075 (more negative than C/D) — suggesting the model</w:t>
+      </w:r>
+      <w:r>
+        <w:t xml:space="preserve"> </w:t>
+      </w:r>
+      <w:r>
+        <w:t xml:space="preserve">“half-recognizes”</w:t>
+      </w:r>
+      <w:r>
+        <w:t xml:space="preserve"> </w:t>
+      </w:r>
+      <w:r>
+        <w:t xml:space="preserve">Elephant as related to size (it IS the largest by mass, just not tallest), so it’s slightly less confused about that wrong answer.</w:t>
+      </w:r>
+    </w:p>
+    <w:bookmarkEnd w:id="25"/>
+    <w:bookmarkStart w:id="26" w:name="X70c3451723bcea0c56e30a491cd53258c5c5e93"/>
+    <w:p>
+      <w:pPr>
+        <w:pStyle w:val="Heading4"/>
+      </w:pPr>
+      <w:r>
+        <w:t xml:space="preserve">⚠️ Counter-example: Q5 Geography —</w:t>
+      </w:r>
+      <w:r>
+        <w:t xml:space="preserve"> </w:t>
+      </w:r>
+      <w:r>
+        <w:t xml:space="preserve">“Most populous country?”</w:t>
+      </w:r>
+      <w:r>
+        <w:t xml:space="preserve"> </w:t>
+      </w:r>
+      <w:r>
+        <w:t xml:space="preserve">(signal fails)</w:t>
+      </w:r>
+    </w:p>
+    <w:tbl>
+      <w:tblPr>
+        <w:tblStyle w:val="Table"/>
+        <w:tblW w:type="auto" w:w="0"/>
+        <w:tblLook w:firstRow="1" w:lastRow="0" w:firstColumn="0" w:lastColumn="0" w:noHBand="0" w:noVBand="0" w:val="0020"/>
+      </w:tblPr>
+      <w:tblGrid>
+        <w:gridCol w:w="2640"/>
+        <w:gridCol w:w="2640"/>
+        <w:gridCol w:w="2640"/>
+      </w:tblGrid>
+      <w:tr>
+        <w:trPr>
+          <w:tblHeader w:val="on"/>
+        </w:trPr>
+        <w:tc>
+          <w:tcPr/>
+          <w:p>
+            <w:pPr>
+              <w:pStyle w:val="Compact"/>
+            </w:pPr>
+            <w:r>
+              <w:t xml:space="preserve">Option</w:t>
+            </w:r>
+          </w:p>
+        </w:tc>
+        <w:tc>
+          <w:tcPr/>
+          <w:p>
+            <w:pPr>
+              <w:pStyle w:val="Compact"/>
+            </w:pPr>
+            <w:r>
+              <w:t xml:space="preserve">confused</w:t>
+            </w:r>
+          </w:p>
+        </w:tc>
+        <w:tc>
+          <w:tcPr/>
+          <w:p>
+            <w:pPr>
+              <w:pStyle w:val="Compact"/>
+            </w:pPr>
+            <w:r>
+              <w:t xml:space="preserve">stubborn</w:t>
+            </w:r>
+          </w:p>
+        </w:tc>
+      </w:tr>
+      <w:tr>
+        <w:tc>
+          <w:tcPr/>
+          <w:p>
+            <w:pPr>
+              <w:pStyle w:val="Compact"/>
+            </w:pPr>
+            <w:r>
+              <w:t xml:space="preserve">✗ A) United States</w:t>
+            </w:r>
+          </w:p>
+        </w:tc>
+        <w:tc>
+          <w:tcPr/>
+          <w:p>
+            <w:pPr>
+              <w:pStyle w:val="Compact"/>
+            </w:pPr>
+            <w:r>
+              <w:t xml:space="preserve">−0.081</w:t>
+            </w:r>
+          </w:p>
+        </w:tc>
+        <w:tc>
+          <w:tcPr/>
+          <w:p>
+            <w:pPr>
+              <w:pStyle w:val="Compact"/>
+            </w:pPr>
+            <w:r>
+              <w:t xml:space="preserve">+0.028</w:t>
+            </w:r>
+          </w:p>
+        </w:tc>
+      </w:tr>
+      <w:tr>
+        <w:tc>
+          <w:tcPr/>
+          <w:p>
+            <w:pPr>
+              <w:pStyle w:val="Compact"/>
+            </w:pPr>
+            <w:r>
+              <w:t xml:space="preserve">✗ B) Russia</w:t>
+            </w:r>
+          </w:p>
+        </w:tc>
+        <w:tc>
+          <w:tcPr/>
+          <w:p>
+            <w:pPr>
+              <w:pStyle w:val="Compact"/>
+            </w:pPr>
+            <w:r>
+              <w:t xml:space="preserve">−0.061</w:t>
+            </w:r>
+          </w:p>
+        </w:tc>
+        <w:tc>
+          <w:tcPr/>
+          <w:p>
+            <w:pPr>
+              <w:pStyle w:val="Compact"/>
+            </w:pPr>
+            <w:r>
+              <w:rPr>
+                <w:b/>
+                <w:bCs/>
+              </w:rPr>
+              <w:t xml:space="preserve">+0.104</w:t>
+            </w:r>
+          </w:p>
+        </w:tc>
+      </w:tr>
+      <w:tr>
+        <w:tc>
+          <w:tcPr/>
+          <w:p>
+            <w:pPr>
+              <w:pStyle w:val="Compact"/>
+            </w:pPr>
+            <w:r>
+              <w:rPr>
+                <w:b/>
+                <w:bCs/>
+              </w:rPr>
+              <w:t xml:space="preserve">✓ C) India</w:t>
+            </w:r>
+          </w:p>
+        </w:tc>
+        <w:tc>
+          <w:tcPr/>
+          <w:p>
+            <w:pPr>
+              <w:pStyle w:val="Compact"/>
+            </w:pPr>
+            <w:r>
+              <w:t xml:space="preserve">−0.071</w:t>
+            </w:r>
+          </w:p>
+        </w:tc>
+        <w:tc>
+          <w:tcPr/>
+          <w:p>
+            <w:pPr>
+              <w:pStyle w:val="Compact"/>
+            </w:pPr>
+            <w:r>
+              <w:t xml:space="preserve">+0.044</w:t>
+            </w:r>
+          </w:p>
+        </w:tc>
+      </w:tr>
+      <w:tr>
+        <w:tc>
+          <w:tcPr/>
+          <w:p>
+            <w:pPr>
+              <w:pStyle w:val="Compact"/>
+            </w:pPr>
+            <w:r>
+              <w:t xml:space="preserve">✗ D) Brazil</w:t>
+            </w:r>
+          </w:p>
+        </w:tc>
+        <w:tc>
+          <w:tcPr/>
+          <w:p>
+            <w:pPr>
+              <w:pStyle w:val="Compact"/>
+            </w:pPr>
+            <w:r>
+              <w:t xml:space="preserve">−0.044</w:t>
+            </w:r>
+          </w:p>
+        </w:tc>
+        <w:tc>
+          <w:tcPr/>
+          <w:p>
+            <w:pPr>
+              <w:pStyle w:val="Compact"/>
+            </w:pPr>
+            <w:r>
+              <w:rPr>
+                <w:b/>
+                <w:bCs/>
+              </w:rPr>
+              <w:t xml:space="preserve">+0.107</w:t>
+            </w:r>
+          </w:p>
+        </w:tc>
+      </w:tr>
+    </w:tbl>
+    <w:p>
+      <w:pPr>
+        <w:pStyle w:val="BodyText"/>
+      </w:pPr>
+      <w:r>
+        <w:rPr>
+          <w:b/>
+          <w:bCs/>
+        </w:rPr>
+        <w:t xml:space="preserve">Problem</w:t>
+      </w:r>
+      <w:r>
+        <w:t xml:space="preserve">: signal does NOT robustly point to C) India here. confused and stubborn levels are similar across all 4 options. Russia and Brazil have higher stubborn than India.</w:t>
+      </w:r>
+    </w:p>
+    <w:p>
+      <w:pPr>
+        <w:pStyle w:val="BodyText"/>
+      </w:pPr>
+      <w:r>
+        <w:rPr>
+          <w:b/>
+          <w:bCs/>
+        </w:rPr>
+        <w:t xml:space="preserve">Why</w:t>
+      </w:r>
+      <w:r>
+        <w:t xml:space="preserve">: two possibilities:</w:t>
+      </w:r>
+      <w:r>
+        <w:t xml:space="preserve"> </w:t>
+      </w:r>
+      <w:r>
+        <w:t xml:space="preserve">1.</w:t>
+      </w:r>
+      <w:r>
+        <w:t xml:space="preserve"> </w:t>
+      </w:r>
+      <w:r>
+        <w:rPr>
+          <w:b/>
+          <w:bCs/>
+        </w:rPr>
+        <w:t xml:space="preserve">Model isn’t sure</w:t>
+      </w:r>
+      <w:r>
+        <w:t xml:space="preserve">: India recently overtook China for most populous (and the question doesn’t list China!). The model may be uncertain between India and USA/Russia, leading to weak dissonance even on wrong options</w:t>
+      </w:r>
+      <w:r>
+        <w:t xml:space="preserve"> </w:t>
+      </w:r>
+      <w:r>
+        <w:t xml:space="preserve">2.</w:t>
+      </w:r>
+      <w:r>
+        <w:t xml:space="preserve"> </w:t>
+      </w:r>
+      <w:r>
+        <w:rPr>
+          <w:b/>
+          <w:bCs/>
+        </w:rPr>
+        <w:t xml:space="preserve">Bad question design</w:t>
+      </w:r>
+      <w:r>
+        <w:t xml:space="preserve">: all 4 options are</w:t>
+      </w:r>
+      <w:r>
+        <w:t xml:space="preserve"> </w:t>
+      </w:r>
+      <w:r>
+        <w:t xml:space="preserve">“major countries”</w:t>
+      </w:r>
+      <w:r>
+        <w:t xml:space="preserve">, so wrong answers aren’t</w:t>
+      </w:r>
+      <w:r>
+        <w:t xml:space="preserve"> </w:t>
+      </w:r>
+      <w:r>
+        <w:t xml:space="preserve">“obviously absurd”</w:t>
+      </w:r>
+      <w:r>
+        <w:t xml:space="preserve"> </w:t>
+      </w:r>
+      <w:r>
+        <w:t xml:space="preserve">(unlike</w:t>
+      </w:r>
+      <w:r>
+        <w:t xml:space="preserve"> </w:t>
+      </w:r>
+      <w:r>
+        <w:t xml:space="preserve">“12×12=124”</w:t>
+      </w:r>
+      <w:r>
+        <w:t xml:space="preserve">)</w:t>
+      </w:r>
+    </w:p>
+    <w:p>
+      <w:pPr>
+        <w:pStyle w:val="BodyText"/>
+      </w:pPr>
+      <w:r>
+        <w:rPr>
+          <w:b/>
+          <w:bCs/>
+        </w:rPr>
+        <w:t xml:space="preserve">This tells us</w:t>
+      </w:r>
+      <w:r>
+        <w:t xml:space="preserve">: the MCQ surprise signal is strongest on questions that are</w:t>
+      </w:r>
+      <w:r>
+        <w:t xml:space="preserve"> </w:t>
+      </w:r>
+      <w:r>
+        <w:rPr>
+          <w:b/>
+          <w:bCs/>
+        </w:rPr>
+        <w:t xml:space="preserve">unambiguous</w:t>
+      </w:r>
+      <w:r>
+        <w:t xml:space="preserve"> </w:t>
+      </w:r>
+      <w:r>
+        <w:t xml:space="preserve">for the model; on</w:t>
+      </w:r>
+      <w:r>
+        <w:t xml:space="preserve"> </w:t>
+      </w:r>
+      <w:r>
+        <w:rPr>
+          <w:b/>
+          <w:bCs/>
+        </w:rPr>
+        <w:t xml:space="preserve">inherently uncertain</w:t>
+      </w:r>
+      <w:r>
+        <w:t xml:space="preserve"> </w:t>
+      </w:r>
+      <w:r>
+        <w:t xml:space="preserve">questions, the signal blunts. This is exactly what we’d want to test next:</w:t>
+      </w:r>
+      <w:r>
+        <w:t xml:space="preserve"> </w:t>
+      </w:r>
+      <w:r>
+        <w:rPr>
+          <w:b/>
+          <w:bCs/>
+        </w:rPr>
+        <w:t xml:space="preserve">uncertain vs certain</w:t>
+      </w:r>
+      <w:r>
+        <w:t xml:space="preserve"> </w:t>
+      </w:r>
+      <w:r>
+        <w:t xml:space="preserve">model responses.</w:t>
+      </w:r>
+    </w:p>
     <w:p>
       <w:r>
         <w:pict>
@@ -1738,9 +3613,203 @@
         </w:pict>
       </w:r>
     </w:p>
-    <w:bookmarkEnd w:id="22"/>
-    <w:bookmarkEnd w:id="23"/>
-    <w:bookmarkStart w:id="27" w:name="interpretation"/>
+    <w:bookmarkEnd w:id="26"/>
+    <w:bookmarkEnd w:id="27"/>
+    <w:bookmarkStart w:id="28" w:name="pattern-across-the-examples"/>
+    <w:p>
+      <w:pPr>
+        <w:pStyle w:val="Heading3"/>
+      </w:pPr>
+      <w:r>
+        <w:t xml:space="preserve">2.4 Pattern across the examples</w:t>
+      </w:r>
+    </w:p>
+    <w:p>
+      <w:pPr>
+        <w:pStyle w:val="FirstParagraph"/>
+      </w:pPr>
+      <w:r>
+        <w:t xml:space="preserve">Looking at all 4 examples together, a</w:t>
+      </w:r>
+      <w:r>
+        <w:t xml:space="preserve"> </w:t>
+      </w:r>
+      <w:r>
+        <w:rPr>
+          <w:b/>
+          <w:bCs/>
+        </w:rPr>
+        <w:t xml:space="preserve">universal</w:t>
+      </w:r>
+      <w:r>
+        <w:rPr>
+          <w:b/>
+          <w:bCs/>
+        </w:rPr>
+        <w:t xml:space="preserve"> </w:t>
+      </w:r>
+      <w:r>
+        <w:rPr>
+          <w:b/>
+          <w:bCs/>
+        </w:rPr>
+        <w:t xml:space="preserve">“correct answer fingerprint”</w:t>
+      </w:r>
+      <w:r>
+        <w:t xml:space="preserve"> </w:t>
+      </w:r>
+      <w:r>
+        <w:t xml:space="preserve">emerges:</w:t>
+      </w:r>
+    </w:p>
+    <w:p>
+      <w:pPr>
+        <w:pStyle w:val="SourceCode"/>
+      </w:pPr>
+      <w:r>
+        <w:rPr>
+          <w:rStyle w:val="VerbatimChar"/>
+        </w:rPr>
+        <w:t xml:space="preserve">Correct answer signature (5-vector pattern):</w:t>
+      </w:r>
+      <w:r>
+        <w:br/>
+      </w:r>
+      <w:r>
+        <w:rPr>
+          <w:rStyle w:val="VerbatimChar"/>
+        </w:rPr>
+        <w:t xml:space="preserve">  confused   ↓↓↓  lowest (not confused)</w:t>
+      </w:r>
+      <w:r>
+        <w:br/>
+      </w:r>
+      <w:r>
+        <w:rPr>
+          <w:rStyle w:val="VerbatimChar"/>
+        </w:rPr>
+        <w:t xml:space="preserve">  stubborn   ↓↓↓  lowest (not resistant)</w:t>
+      </w:r>
+      <w:r>
+        <w:br/>
+      </w:r>
+      <w:r>
+        <w:rPr>
+          <w:rStyle w:val="VerbatimChar"/>
+        </w:rPr>
+        <w:t xml:space="preserve">  confident  ↑↑↑  highest (confident)</w:t>
+      </w:r>
+      <w:r>
+        <w:br/>
+      </w:r>
+      <w:r>
+        <w:rPr>
+          <w:rStyle w:val="VerbatimChar"/>
+        </w:rPr>
+        <w:t xml:space="preserve">  bored      ↑↑   higher (no novelty)</w:t>
+      </w:r>
+      <w:r>
+        <w:br/>
+      </w:r>
+      <w:r>
+        <w:rPr>
+          <w:rStyle w:val="VerbatimChar"/>
+        </w:rPr>
+        <w:t xml:space="preserve">  confirmed  ↑    slight rise (expectation validated)</w:t>
+      </w:r>
+    </w:p>
+    <w:p>
+      <w:pPr>
+        <w:pStyle w:val="FirstParagraph"/>
+      </w:pPr>
+      <w:r>
+        <w:t xml:space="preserve">Wrong answers show the inverse (except for confident, which is often still positive on wrongs because instruction-tuned models tend to</w:t>
+      </w:r>
+      <w:r>
+        <w:t xml:space="preserve"> </w:t>
+      </w:r>
+      <w:r>
+        <w:t xml:space="preserve">“appear confident”</w:t>
+      </w:r>
+      <w:r>
+        <w:t xml:space="preserve"> </w:t>
+      </w:r>
+      <w:r>
+        <w:t xml:space="preserve">about anything).</w:t>
+      </w:r>
+    </w:p>
+    <w:p>
+      <w:pPr>
+        <w:pStyle w:val="BodyText"/>
+      </w:pPr>
+      <w:r>
+        <w:rPr>
+          <w:b/>
+          <w:bCs/>
+        </w:rPr>
+        <w:t xml:space="preserve">The strongest single discriminator is</w:t>
+      </w:r>
+      <w:r>
+        <w:rPr>
+          <w:b/>
+          <w:bCs/>
+        </w:rPr>
+        <w:t xml:space="preserve"> </w:t>
+      </w:r>
+      <w:r>
+        <w:rPr>
+          <w:rStyle w:val="VerbatimChar"/>
+          <w:b/>
+          <w:bCs/>
+        </w:rPr>
+        <w:t xml:space="preserve">stubborn</w:t>
+      </w:r>
+      <w:r>
+        <w:t xml:space="preserve"> </w:t>
+      </w:r>
+      <w:r>
+        <w:t xml:space="preserve">— d=−1.34 means stubborn is</w:t>
+      </w:r>
+      <w:r>
+        <w:t xml:space="preserve"> </w:t>
+      </w:r>
+      <w:r>
+        <w:rPr>
+          <w:b/>
+          <w:bCs/>
+        </w:rPr>
+        <w:t xml:space="preserve">almost always positive on wrong answers</w:t>
+      </w:r>
+      <w:r>
+        <w:t xml:space="preserve"> </w:t>
+      </w:r>
+      <w:r>
+        <w:t xml:space="preserve">and</w:t>
+      </w:r>
+      <w:r>
+        <w:t xml:space="preserve"> </w:t>
+      </w:r>
+      <w:r>
+        <w:rPr>
+          <w:b/>
+          <w:bCs/>
+        </w:rPr>
+        <w:t xml:space="preserve">often negative on correct answers</w:t>
+      </w:r>
+      <w:r>
+        <w:t xml:space="preserve">. It’s a robust wrong-detector.</w:t>
+      </w:r>
+    </w:p>
+    <w:p>
+      <w:r>
+        <w:pict>
+          <v:rect style="width:0;height:1.5pt" o:hralign="center" o:hrstd="t" o:hr="t"/>
+        </w:pict>
+      </w:r>
+    </w:p>
+    <w:bookmarkEnd w:id="28"/>
+    <w:bookmarkEnd w:id="29"/>
+    <w:bookmarkStart w:id="33" w:name="interpretation"/>
     <w:p>
       <w:pPr>
         <w:pStyle w:val="Heading2"/>
@@ -1749,7 +3818,7 @@
         <w:t xml:space="preserve">3. Interpretation</w:t>
       </w:r>
     </w:p>
-    <w:bookmarkStart w:id="24" w:name="the-model-performs-internal-judgment"/>
+    <w:bookmarkStart w:id="30" w:name="the-model-performs-internal-judgment"/>
     <w:p>
       <w:pPr>
         <w:pStyle w:val="Heading3"/>
@@ -2028,8 +4097,8 @@
         <w:t xml:space="preserve">This is the core value of the experiment.</w:t>
       </w:r>
     </w:p>
-    <w:bookmarkEnd w:id="24"/>
-    <w:bookmarkStart w:id="25" w:name="proposed-surprise-score-formula"/>
+    <w:bookmarkEnd w:id="30"/>
+    <w:bookmarkStart w:id="31" w:name="proposed-surprise-score-formula"/>
     <w:p>
       <w:pPr>
         <w:pStyle w:val="Heading3"/>
@@ -2183,8 +4252,8 @@
         <w:t xml:space="preserve">goal.</w:t>
       </w:r>
     </w:p>
-    <w:bookmarkEnd w:id="25"/>
-    <w:bookmarkStart w:id="26" w:name="why-does-surprised-itself-have-d-0"/>
+    <w:bookmarkEnd w:id="31"/>
+    <w:bookmarkStart w:id="32" w:name="why-does-surprised-itself-have-d-0"/>
     <w:p>
       <w:pPr>
         <w:pStyle w:val="Heading3"/>
@@ -2347,9 +4416,9 @@
         </w:pict>
       </w:r>
     </w:p>
-    <w:bookmarkEnd w:id="26"/>
-    <w:bookmarkEnd w:id="27"/>
-    <w:bookmarkStart w:id="30" w:name="limitations-next-steps"/>
+    <w:bookmarkEnd w:id="32"/>
+    <w:bookmarkEnd w:id="33"/>
+    <w:bookmarkStart w:id="36" w:name="limitations-next-steps"/>
     <w:p>
       <w:pPr>
         <w:pStyle w:val="Heading2"/>
@@ -2358,7 +4427,7 @@
         <w:t xml:space="preserve">4. Limitations + Next Steps</w:t>
       </w:r>
     </w:p>
-    <w:bookmarkStart w:id="28" w:name="limitations"/>
+    <w:bookmarkStart w:id="34" w:name="limitations"/>
     <w:p>
       <w:pPr>
         <w:pStyle w:val="Heading3"/>
@@ -2489,8 +4558,8 @@
         <w:t xml:space="preserve">: we assumed model knows all 40 answers. Next run should first measure baseline accuracy ≥90% before running forward experiment</w:t>
       </w:r>
     </w:p>
-    <w:bookmarkEnd w:id="28"/>
-    <w:bookmarkStart w:id="29" w:name="next-experiments-priority-sorted"/>
+    <w:bookmarkEnd w:id="34"/>
+    <w:bookmarkStart w:id="35" w:name="next-experiments-priority-sorted"/>
     <w:p>
       <w:pPr>
         <w:pStyle w:val="Heading3"/>
@@ -2793,9 +4862,9 @@
         </w:pict>
       </w:r>
     </w:p>
-    <w:bookmarkEnd w:id="29"/>
-    <w:bookmarkEnd w:id="30"/>
-    <w:bookmarkStart w:id="31" w:name="resources-files"/>
+    <w:bookmarkEnd w:id="35"/>
+    <w:bookmarkEnd w:id="36"/>
+    <w:bookmarkStart w:id="37" w:name="resources-files"/>
     <w:p>
       <w:pPr>
         <w:pStyle w:val="Heading2"/>
@@ -3023,8 +5092,8 @@
         <w:t xml:space="preserve">.</w:t>
       </w:r>
     </w:p>
-    <w:bookmarkEnd w:id="31"/>
-    <w:bookmarkEnd w:id="32"/>
+    <w:bookmarkEnd w:id="37"/>
+    <w:bookmarkEnd w:id="38"/>
     <w:sectPr>
       <w:footnotePr>
         <w:numRestart w:val="eachSect"/>

</xml_diff>